<commit_message>
Lab 5 completado: File Integrity Monitoring (FIM)
</commit_message>
<xml_diff>
--- a/01-bitacora-ejecucion/Guia_Configuracion_Wazuh_actualizada.docx
+++ b/01-bitacora-ejecucion/Guia_Configuracion_Wazuh_actualizada.docx
@@ -17341,6 +17341,825 @@
       <w:proofErr w:type="spellEnd"/>
       <w:r>
         <w:t xml:space="preserve"> 69.0. ✓</w:t>
+      </w:r>
+    </w:p>
+    <w:p>
+      <w:r>
+        <w:br w:type="page"/>
+      </w:r>
+    </w:p>
+    <w:p>
+      <w:pPr>
+        <w:spacing w:before="400" w:after="200"/>
+      </w:pPr>
+      <w:r>
+        <w:lastRenderedPageBreak/>
+        <w:t>Parte 12 — Laboratorio 5: File Integrity Monitoring (FIM)</w:t>
+      </w:r>
+    </w:p>
+    <w:p>
+      <w:pPr>
+        <w:spacing w:after="150"/>
+      </w:pPr>
+      <w:r>
+        <w:t>Este laboratorio documenta la configuracion del modulo FIM de Wazuh para vigilar archivos criticos del sistema en tiempo real y la simulacion de una modificacion no autorizada en la configuracion de SSH, demostrando la capacidad de deteccion de cambios no autorizados exigida en marcos de cumplimiento como PCI-DSS e ISO 27001.</w:t>
+      </w:r>
+    </w:p>
+    <w:p>
+      <w:pPr>
+        <w:spacing w:before="300" w:after="150"/>
+      </w:pPr>
+      <w:r>
+        <w:t>Paso 57 — Configurar syscheck en ossec.conf del agente</w:t>
+      </w:r>
+    </w:p>
+    <w:p>
+      <w:pPr>
+        <w:spacing w:after="150"/>
+      </w:pPr>
+      <w:r>
+        <w:t>En el agente Kali, se edito /var/ossec/etc/ossec.conf para anadir monitoreo en tiempo real de /etc y /usr/bin:</w:t>
+      </w:r>
+    </w:p>
+    <w:p>
+      <w:pPr>
+        <w:shd w:val="clear" w:color="auto" w:fill="F2F2F2"/>
+        <w:spacing w:after="20"/>
+        <w:ind w:left="200"/>
+      </w:pPr>
+      <w:r>
+        <w:rPr>
+          <w:rFonts w:ascii="Consolas" w:eastAsia="Consolas" w:hAnsi="Consolas" w:cs="Consolas"/>
+          <w:sz w:val="19"/>
+          <w:szCs w:val="19"/>
+        </w:rPr>
+        <w:t>sudo nano /var/ossec/etc/ossec.conf</w:t>
+      </w:r>
+    </w:p>
+    <w:p>
+      <w:pPr>
+        <w:spacing w:after="120"/>
+      </w:pPr>
+      <w:r>
+        <w:t>Linea anadida dentro del bloque &lt;syscheck&gt;:</w:t>
+      </w:r>
+    </w:p>
+    <w:p>
+      <w:pPr>
+        <w:shd w:val="clear" w:color="auto" w:fill="F2F2F2"/>
+        <w:spacing w:after="20"/>
+        <w:ind w:left="200"/>
+        <w:rPr>
+          <w:lang w:val="en-US"/>
+        </w:rPr>
+      </w:pPr>
+      <w:r>
+        <w:rPr>
+          <w:rFonts w:ascii="Consolas" w:eastAsia="Consolas" w:hAnsi="Consolas" w:cs="Consolas"/>
+          <w:sz w:val="19"/>
+          <w:szCs w:val="19"/>
+          <w:lang w:val="en-US"/>
+        </w:rPr>
+        <w:t xml:space="preserve">&lt;directories </w:t>
+      </w:r>
+      <w:proofErr w:type="spellStart"/>
+      <w:r>
+        <w:rPr>
+          <w:rFonts w:ascii="Consolas" w:eastAsia="Consolas" w:hAnsi="Consolas" w:cs="Consolas"/>
+          <w:sz w:val="19"/>
+          <w:szCs w:val="19"/>
+          <w:lang w:val="en-US"/>
+        </w:rPr>
+        <w:t>realtime</w:t>
+      </w:r>
+      <w:proofErr w:type="spellEnd"/>
+      <w:r>
+        <w:rPr>
+          <w:rFonts w:ascii="Consolas" w:eastAsia="Consolas" w:hAnsi="Consolas" w:cs="Consolas"/>
+          <w:sz w:val="19"/>
+          <w:szCs w:val="19"/>
+          <w:lang w:val="en-US"/>
+        </w:rPr>
+        <w:t xml:space="preserve">="yes" </w:t>
+      </w:r>
+      <w:proofErr w:type="spellStart"/>
+      <w:r>
+        <w:rPr>
+          <w:rFonts w:ascii="Consolas" w:eastAsia="Consolas" w:hAnsi="Consolas" w:cs="Consolas"/>
+          <w:sz w:val="19"/>
+          <w:szCs w:val="19"/>
+          <w:lang w:val="en-US"/>
+        </w:rPr>
+        <w:t>check_all</w:t>
+      </w:r>
+      <w:proofErr w:type="spellEnd"/>
+      <w:r>
+        <w:rPr>
+          <w:rFonts w:ascii="Consolas" w:eastAsia="Consolas" w:hAnsi="Consolas" w:cs="Consolas"/>
+          <w:sz w:val="19"/>
+          <w:szCs w:val="19"/>
+          <w:lang w:val="en-US"/>
+        </w:rPr>
+        <w:t>="yes"&gt;/</w:t>
+      </w:r>
+      <w:proofErr w:type="spellStart"/>
+      <w:proofErr w:type="gramStart"/>
+      <w:r>
+        <w:rPr>
+          <w:rFonts w:ascii="Consolas" w:eastAsia="Consolas" w:hAnsi="Consolas" w:cs="Consolas"/>
+          <w:sz w:val="19"/>
+          <w:szCs w:val="19"/>
+          <w:lang w:val="en-US"/>
+        </w:rPr>
+        <w:t>etc</w:t>
+      </w:r>
+      <w:proofErr w:type="spellEnd"/>
+      <w:r>
+        <w:rPr>
+          <w:rFonts w:ascii="Consolas" w:eastAsia="Consolas" w:hAnsi="Consolas" w:cs="Consolas"/>
+          <w:sz w:val="19"/>
+          <w:szCs w:val="19"/>
+          <w:lang w:val="en-US"/>
+        </w:rPr>
+        <w:t>,/</w:t>
+      </w:r>
+      <w:proofErr w:type="spellStart"/>
+      <w:proofErr w:type="gramEnd"/>
+      <w:r>
+        <w:rPr>
+          <w:rFonts w:ascii="Consolas" w:eastAsia="Consolas" w:hAnsi="Consolas" w:cs="Consolas"/>
+          <w:sz w:val="19"/>
+          <w:szCs w:val="19"/>
+          <w:lang w:val="en-US"/>
+        </w:rPr>
+        <w:t>usr</w:t>
+      </w:r>
+      <w:proofErr w:type="spellEnd"/>
+      <w:r>
+        <w:rPr>
+          <w:rFonts w:ascii="Consolas" w:eastAsia="Consolas" w:hAnsi="Consolas" w:cs="Consolas"/>
+          <w:sz w:val="19"/>
+          <w:szCs w:val="19"/>
+          <w:lang w:val="en-US"/>
+        </w:rPr>
+        <w:t>/bin&lt;/directories&gt;</w:t>
+      </w:r>
+    </w:p>
+    <w:p>
+      <w:pPr>
+        <w:spacing w:after="200"/>
+        <w:ind w:left="200"/>
+      </w:pPr>
+      <w:r>
+        <w:rPr>
+          <w:b/>
+          <w:bCs/>
+          <w:i/>
+          <w:iCs/>
+        </w:rPr>
+        <w:t xml:space="preserve">Nota </w:t>
+      </w:r>
+      <w:proofErr w:type="spellStart"/>
+      <w:r>
+        <w:rPr>
+          <w:b/>
+          <w:bCs/>
+          <w:i/>
+          <w:iCs/>
+        </w:rPr>
+        <w:t>tecnica</w:t>
+      </w:r>
+      <w:proofErr w:type="spellEnd"/>
+      <w:r>
+        <w:rPr>
+          <w:b/>
+          <w:bCs/>
+          <w:i/>
+          <w:iCs/>
+        </w:rPr>
+        <w:t xml:space="preserve">: </w:t>
+      </w:r>
+      <w:proofErr w:type="spellStart"/>
+      <w:r>
+        <w:rPr>
+          <w:i/>
+          <w:iCs/>
+        </w:rPr>
+        <w:t>realtime</w:t>
+      </w:r>
+      <w:proofErr w:type="spellEnd"/>
+      <w:r>
+        <w:rPr>
+          <w:i/>
+          <w:iCs/>
+        </w:rPr>
+        <w:t>="yes" activa la deteccion inmediata via inotify en lugar de esperar al siguiente escaneo periodico. check_all="yes" verifica tamano, permisos, propietario, hashes MD5/SHA1/SHA256 e inode. La linea debe estar DENTRO del bloque syscheck, no fuera — error cometido y corregido durante la configuracion.</w:t>
+      </w:r>
+    </w:p>
+    <w:p>
+      <w:pPr>
+        <w:spacing w:before="300" w:after="150"/>
+      </w:pPr>
+      <w:r>
+        <w:t>Paso 58 — Simular modificacion no autorizada en sshd_config</w:t>
+      </w:r>
+    </w:p>
+    <w:p>
+      <w:pPr>
+        <w:spacing w:after="150"/>
+      </w:pPr>
+      <w:r>
+        <w:t>Tras reiniciar el agente y esperar el escaneo baseline, se simulo un cambio tipico de atacante: habilitar el login de root via SSH modificando sshd_config:</w:t>
+      </w:r>
+    </w:p>
+    <w:p>
+      <w:pPr>
+        <w:shd w:val="clear" w:color="auto" w:fill="F2F2F2"/>
+        <w:spacing w:after="20"/>
+        <w:ind w:left="200"/>
+        <w:rPr>
+          <w:lang w:val="en-US"/>
+        </w:rPr>
+      </w:pPr>
+      <w:proofErr w:type="spellStart"/>
+      <w:r>
+        <w:rPr>
+          <w:rFonts w:ascii="Consolas" w:eastAsia="Consolas" w:hAnsi="Consolas" w:cs="Consolas"/>
+          <w:sz w:val="19"/>
+          <w:szCs w:val="19"/>
+          <w:lang w:val="en-US"/>
+        </w:rPr>
+        <w:t>sudo</w:t>
+      </w:r>
+      <w:proofErr w:type="spellEnd"/>
+      <w:r>
+        <w:rPr>
+          <w:rFonts w:ascii="Consolas" w:eastAsia="Consolas" w:hAnsi="Consolas" w:cs="Consolas"/>
+          <w:sz w:val="19"/>
+          <w:szCs w:val="19"/>
+          <w:lang w:val="en-US"/>
+        </w:rPr>
+        <w:t xml:space="preserve"> sed -</w:t>
+      </w:r>
+      <w:proofErr w:type="spellStart"/>
+      <w:r>
+        <w:rPr>
+          <w:rFonts w:ascii="Consolas" w:eastAsia="Consolas" w:hAnsi="Consolas" w:cs="Consolas"/>
+          <w:sz w:val="19"/>
+          <w:szCs w:val="19"/>
+          <w:lang w:val="en-US"/>
+        </w:rPr>
+        <w:t>i</w:t>
+      </w:r>
+      <w:proofErr w:type="spellEnd"/>
+      <w:r>
+        <w:rPr>
+          <w:rFonts w:ascii="Consolas" w:eastAsia="Consolas" w:hAnsi="Consolas" w:cs="Consolas"/>
+          <w:sz w:val="19"/>
+          <w:szCs w:val="19"/>
+          <w:lang w:val="en-US"/>
+        </w:rPr>
+        <w:t xml:space="preserve"> '</w:t>
+      </w:r>
+      <w:proofErr w:type="gramStart"/>
+      <w:r>
+        <w:rPr>
+          <w:rFonts w:ascii="Consolas" w:eastAsia="Consolas" w:hAnsi="Consolas" w:cs="Consolas"/>
+          <w:sz w:val="19"/>
+          <w:szCs w:val="19"/>
+          <w:lang w:val="en-US"/>
+        </w:rPr>
+        <w:t>s/#</w:t>
+      </w:r>
+      <w:proofErr w:type="gramEnd"/>
+      <w:r>
+        <w:rPr>
+          <w:rFonts w:ascii="Consolas" w:eastAsia="Consolas" w:hAnsi="Consolas" w:cs="Consolas"/>
+          <w:sz w:val="19"/>
+          <w:szCs w:val="19"/>
+          <w:lang w:val="en-US"/>
+        </w:rPr>
+        <w:t>PermitRootLogin prohibit-password/</w:t>
+      </w:r>
+      <w:proofErr w:type="spellStart"/>
+      <w:r>
+        <w:rPr>
+          <w:rFonts w:ascii="Consolas" w:eastAsia="Consolas" w:hAnsi="Consolas" w:cs="Consolas"/>
+          <w:sz w:val="19"/>
+          <w:szCs w:val="19"/>
+          <w:lang w:val="en-US"/>
+        </w:rPr>
+        <w:t>PermitRootLogin</w:t>
+      </w:r>
+      <w:proofErr w:type="spellEnd"/>
+      <w:r>
+        <w:rPr>
+          <w:rFonts w:ascii="Consolas" w:eastAsia="Consolas" w:hAnsi="Consolas" w:cs="Consolas"/>
+          <w:sz w:val="19"/>
+          <w:szCs w:val="19"/>
+          <w:lang w:val="en-US"/>
+        </w:rPr>
+        <w:t xml:space="preserve"> yes/' /</w:t>
+      </w:r>
+      <w:proofErr w:type="spellStart"/>
+      <w:r>
+        <w:rPr>
+          <w:rFonts w:ascii="Consolas" w:eastAsia="Consolas" w:hAnsi="Consolas" w:cs="Consolas"/>
+          <w:sz w:val="19"/>
+          <w:szCs w:val="19"/>
+          <w:lang w:val="en-US"/>
+        </w:rPr>
+        <w:t>etc</w:t>
+      </w:r>
+      <w:proofErr w:type="spellEnd"/>
+      <w:r>
+        <w:rPr>
+          <w:rFonts w:ascii="Consolas" w:eastAsia="Consolas" w:hAnsi="Consolas" w:cs="Consolas"/>
+          <w:sz w:val="19"/>
+          <w:szCs w:val="19"/>
+          <w:lang w:val="en-US"/>
+        </w:rPr>
+        <w:t>/ssh/</w:t>
+      </w:r>
+      <w:proofErr w:type="spellStart"/>
+      <w:r>
+        <w:rPr>
+          <w:rFonts w:ascii="Consolas" w:eastAsia="Consolas" w:hAnsi="Consolas" w:cs="Consolas"/>
+          <w:sz w:val="19"/>
+          <w:szCs w:val="19"/>
+          <w:lang w:val="en-US"/>
+        </w:rPr>
+        <w:t>sshd_config</w:t>
+      </w:r>
+      <w:proofErr w:type="spellEnd"/>
+    </w:p>
+    <w:p>
+      <w:pPr>
+        <w:spacing w:after="200"/>
+        <w:ind w:left="200"/>
+      </w:pPr>
+      <w:proofErr w:type="spellStart"/>
+      <w:r>
+        <w:rPr>
+          <w:b/>
+          <w:bCs/>
+          <w:i/>
+          <w:iCs/>
+        </w:rPr>
+        <w:t>Por que</w:t>
+      </w:r>
+      <w:proofErr w:type="spellEnd"/>
+      <w:r>
+        <w:rPr>
+          <w:b/>
+          <w:bCs/>
+          <w:i/>
+          <w:iCs/>
+        </w:rPr>
+        <w:t xml:space="preserve"> es relevante: </w:t>
+      </w:r>
+      <w:r>
+        <w:rPr>
+          <w:i/>
+          <w:iCs/>
+        </w:rPr>
+        <w:t>habilitar PermitRootLogin yes es una de las primeras modificaciones que un atacante realiza tras comprometer un sistema Linux para garantizar acceso root persistente via SSH. FIM detecta este cambio inmediatamente, permitiendo al equipo SOC responder antes de que el atacante consolide el acceso.</w:t>
+      </w:r>
+    </w:p>
+    <w:p>
+      <w:pPr>
+        <w:spacing w:before="300" w:after="150"/>
+      </w:pPr>
+      <w:r>
+        <w:t>Paso 59 — Alerta FIM detectada en Dashboard</w:t>
+      </w:r>
+    </w:p>
+    <w:p>
+      <w:pPr>
+        <w:spacing w:after="150"/>
+      </w:pPr>
+      <w:r>
+        <w:t>En wazuh-alerts-* (busqueda rule.groups:syscheck) aparecio inmediatamente la alerta con los siguientes datos:</w:t>
+      </w:r>
+    </w:p>
+    <w:p>
+      <w:pPr>
+        <w:numPr>
+          <w:ilvl w:val="0"/>
+          <w:numId w:val="1"/>
+        </w:numPr>
+        <w:spacing w:after="80"/>
+      </w:pPr>
+      <w:r>
+        <w:rPr>
+          <w:b/>
+          <w:bCs/>
+        </w:rPr>
+        <w:t xml:space="preserve">Archivo: </w:t>
+      </w:r>
+      <w:r>
+        <w:t>/etc/ssh/sshd_config</w:t>
+      </w:r>
+    </w:p>
+    <w:p>
+      <w:pPr>
+        <w:numPr>
+          <w:ilvl w:val="0"/>
+          <w:numId w:val="1"/>
+        </w:numPr>
+        <w:spacing w:after="80"/>
+      </w:pPr>
+      <w:r>
+        <w:rPr>
+          <w:b/>
+          <w:bCs/>
+        </w:rPr>
+        <w:t xml:space="preserve">Evento: </w:t>
+      </w:r>
+      <w:r>
+        <w:t>modified</w:t>
+      </w:r>
+    </w:p>
+    <w:p>
+      <w:pPr>
+        <w:numPr>
+          <w:ilvl w:val="0"/>
+          <w:numId w:val="1"/>
+        </w:numPr>
+        <w:spacing w:after="80"/>
+      </w:pPr>
+      <w:r>
+        <w:rPr>
+          <w:b/>
+          <w:bCs/>
+        </w:rPr>
+        <w:t xml:space="preserve">Modo: </w:t>
+      </w:r>
+      <w:r>
+        <w:t>realtime</w:t>
+      </w:r>
+    </w:p>
+    <w:p>
+      <w:pPr>
+        <w:numPr>
+          <w:ilvl w:val="0"/>
+          <w:numId w:val="1"/>
+        </w:numPr>
+        <w:spacing w:after="80"/>
+      </w:pPr>
+      <w:r>
+        <w:rPr>
+          <w:b/>
+          <w:bCs/>
+        </w:rPr>
+        <w:t xml:space="preserve">Atributos modificados: </w:t>
+      </w:r>
+      <w:r>
+        <w:t>size, inode, mtime, md5, sha1, sha256</w:t>
+      </w:r>
+    </w:p>
+    <w:p>
+      <w:pPr>
+        <w:numPr>
+          <w:ilvl w:val="0"/>
+          <w:numId w:val="1"/>
+        </w:numPr>
+        <w:spacing w:after="80"/>
+      </w:pPr>
+      <w:r>
+        <w:rPr>
+          <w:b/>
+          <w:bCs/>
+        </w:rPr>
+        <w:t xml:space="preserve">Tamano antes/despues: </w:t>
+      </w:r>
+      <w:r>
+        <w:t>3,424 bytes → 3,409 bytes</w:t>
+      </w:r>
+    </w:p>
+    <w:p>
+      <w:pPr>
+        <w:numPr>
+          <w:ilvl w:val="0"/>
+          <w:numId w:val="1"/>
+        </w:numPr>
+        <w:spacing w:after="80"/>
+      </w:pPr>
+      <w:r>
+        <w:rPr>
+          <w:b/>
+          <w:bCs/>
+        </w:rPr>
+        <w:t xml:space="preserve">MD5 antes: </w:t>
+      </w:r>
+      <w:r>
+        <w:t>0382ac8785a147d5a10f3fa0cdfd8eb5</w:t>
+      </w:r>
+    </w:p>
+    <w:p>
+      <w:pPr>
+        <w:numPr>
+          <w:ilvl w:val="0"/>
+          <w:numId w:val="1"/>
+        </w:numPr>
+        <w:spacing w:after="80"/>
+      </w:pPr>
+      <w:r>
+        <w:rPr>
+          <w:b/>
+          <w:bCs/>
+        </w:rPr>
+        <w:t xml:space="preserve">MD5 despues: </w:t>
+      </w:r>
+      <w:r>
+        <w:t>bb18817364cbf3fc6c5a7bb1f02aa978</w:t>
+      </w:r>
+    </w:p>
+    <w:p>
+      <w:pPr>
+        <w:numPr>
+          <w:ilvl w:val="0"/>
+          <w:numId w:val="1"/>
+        </w:numPr>
+        <w:spacing w:after="80"/>
+      </w:pPr>
+      <w:r>
+        <w:rPr>
+          <w:b/>
+          <w:bCs/>
+        </w:rPr>
+        <w:t xml:space="preserve">Propietario: </w:t>
+      </w:r>
+      <w:r>
+        <w:t>root (uid 0, gid 0)</w:t>
+      </w:r>
+    </w:p>
+    <w:p>
+      <w:pPr>
+        <w:numPr>
+          <w:ilvl w:val="0"/>
+          <w:numId w:val="1"/>
+        </w:numPr>
+        <w:spacing w:after="200"/>
+      </w:pPr>
+      <w:r>
+        <w:rPr>
+          <w:b/>
+          <w:bCs/>
+        </w:rPr>
+        <w:t xml:space="preserve">Fecha modificacion: </w:t>
+      </w:r>
+      <w:r>
+        <w:t>Aug 15, 2026 @ 14:27:39 (deteccion en tiempo real)</w:t>
+      </w:r>
+    </w:p>
+    <w:p>
+      <w:pPr>
+        <w:spacing w:after="200"/>
+        <w:rPr>
+          <w:b/>
+          <w:bCs/>
+          <w:color w:val="808080"/>
+        </w:rPr>
+      </w:pPr>
+      <w:r>
+        <w:rPr>
+          <w:b/>
+          <w:bCs/>
+          <w:color w:val="808080"/>
+        </w:rPr>
+        <w:lastRenderedPageBreak/>
+        <w:drawing>
+          <wp:inline distT="0" distB="0" distL="0" distR="0" wp14:anchorId="11A59719" wp14:editId="00EBE824">
+            <wp:extent cx="5943600" cy="2637155"/>
+            <wp:effectExtent l="0" t="0" r="0" b="0"/>
+            <wp:docPr id="93213056" name="Imagen 1"/>
+            <wp:cNvGraphicFramePr>
+              <a:graphicFrameLocks xmlns:a="http://schemas.openxmlformats.org/drawingml/2006/main" noChangeAspect="1"/>
+            </wp:cNvGraphicFramePr>
+            <a:graphic xmlns:a="http://schemas.openxmlformats.org/drawingml/2006/main">
+              <a:graphicData uri="http://schemas.openxmlformats.org/drawingml/2006/picture">
+                <pic:pic xmlns:pic="http://schemas.openxmlformats.org/drawingml/2006/picture">
+                  <pic:nvPicPr>
+                    <pic:cNvPr id="93213056" name=""/>
+                    <pic:cNvPicPr/>
+                  </pic:nvPicPr>
+                  <pic:blipFill>
+                    <a:blip r:embed="rId11"/>
+                    <a:stretch>
+                      <a:fillRect/>
+                    </a:stretch>
+                  </pic:blipFill>
+                  <pic:spPr>
+                    <a:xfrm>
+                      <a:off x="0" y="0"/>
+                      <a:ext cx="5943600" cy="2637155"/>
+                    </a:xfrm>
+                    <a:prstGeom prst="rect">
+                      <a:avLst/>
+                    </a:prstGeom>
+                  </pic:spPr>
+                </pic:pic>
+              </a:graphicData>
+            </a:graphic>
+          </wp:inline>
+        </w:drawing>
+      </w:r>
+    </w:p>
+    <w:p>
+      <w:pPr>
+        <w:spacing w:after="200"/>
+        <w:rPr>
+          <w:lang w:val="en-US"/>
+        </w:rPr>
+      </w:pPr>
+      <w:r>
+        <w:rPr>
+          <w:b/>
+          <w:bCs/>
+          <w:color w:val="808080"/>
+          <w:lang w:val="en-US"/>
+        </w:rPr>
+        <w:t xml:space="preserve">[ </w:t>
+      </w:r>
+      <w:proofErr w:type="spellStart"/>
+      <w:r>
+        <w:rPr>
+          <w:b/>
+          <w:bCs/>
+          <w:color w:val="808080"/>
+          <w:lang w:val="en-US"/>
+        </w:rPr>
+        <w:t>Alerta</w:t>
+      </w:r>
+      <w:proofErr w:type="spellEnd"/>
+      <w:r>
+        <w:rPr>
+          <w:b/>
+          <w:bCs/>
+          <w:color w:val="808080"/>
+          <w:lang w:val="en-US"/>
+        </w:rPr>
+        <w:t xml:space="preserve"> FIM </w:t>
+      </w:r>
+      <w:proofErr w:type="spellStart"/>
+      <w:r>
+        <w:rPr>
+          <w:b/>
+          <w:bCs/>
+          <w:color w:val="808080"/>
+          <w:lang w:val="en-US"/>
+        </w:rPr>
+        <w:t>syscheck</w:t>
+      </w:r>
+      <w:proofErr w:type="spellEnd"/>
+      <w:r>
+        <w:rPr>
+          <w:b/>
+          <w:bCs/>
+          <w:color w:val="808080"/>
+          <w:lang w:val="en-US"/>
+        </w:rPr>
+        <w:t xml:space="preserve"> /</w:t>
+      </w:r>
+      <w:proofErr w:type="spellStart"/>
+      <w:r>
+        <w:rPr>
+          <w:b/>
+          <w:bCs/>
+          <w:color w:val="808080"/>
+          <w:lang w:val="en-US"/>
+        </w:rPr>
+        <w:t>etc</w:t>
+      </w:r>
+      <w:proofErr w:type="spellEnd"/>
+      <w:r>
+        <w:rPr>
+          <w:b/>
+          <w:bCs/>
+          <w:color w:val="808080"/>
+          <w:lang w:val="en-US"/>
+        </w:rPr>
+        <w:t>/ssh/</w:t>
+      </w:r>
+      <w:proofErr w:type="spellStart"/>
+      <w:r>
+        <w:rPr>
+          <w:b/>
+          <w:bCs/>
+          <w:color w:val="808080"/>
+          <w:lang w:val="en-US"/>
+        </w:rPr>
+        <w:t>sshd_config</w:t>
+      </w:r>
+      <w:proofErr w:type="spellEnd"/>
+      <w:r>
+        <w:rPr>
+          <w:b/>
+          <w:bCs/>
+          <w:color w:val="808080"/>
+          <w:lang w:val="en-US"/>
+        </w:rPr>
+        <w:t xml:space="preserve"> </w:t>
+      </w:r>
+      <w:proofErr w:type="spellStart"/>
+      <w:r>
+        <w:rPr>
+          <w:b/>
+          <w:bCs/>
+          <w:color w:val="808080"/>
+          <w:lang w:val="en-US"/>
+        </w:rPr>
+        <w:t>en</w:t>
+      </w:r>
+      <w:proofErr w:type="spellEnd"/>
+      <w:r>
+        <w:rPr>
+          <w:b/>
+          <w:bCs/>
+          <w:color w:val="808080"/>
+          <w:lang w:val="en-US"/>
+        </w:rPr>
+        <w:t xml:space="preserve"> </w:t>
+      </w:r>
+      <w:proofErr w:type="gramStart"/>
+      <w:r>
+        <w:rPr>
+          <w:b/>
+          <w:bCs/>
+          <w:color w:val="808080"/>
+          <w:lang w:val="en-US"/>
+        </w:rPr>
+        <w:t>Dashboard ]</w:t>
+      </w:r>
+      <w:proofErr w:type="gramEnd"/>
+    </w:p>
+    <w:p>
+      <w:pPr>
+        <w:spacing w:before="300" w:after="150"/>
+      </w:pPr>
+      <w:r>
+        <w:t>Resumen del Laboratorio 5</w:t>
+      </w:r>
+    </w:p>
+    <w:p>
+      <w:pPr>
+        <w:numPr>
+          <w:ilvl w:val="0"/>
+          <w:numId w:val="1"/>
+        </w:numPr>
+        <w:spacing w:after="80"/>
+      </w:pPr>
+      <w:r>
+        <w:t>FIM configurado en modo realtime sobre /etc y /usr/bin. ✓</w:t>
+      </w:r>
+    </w:p>
+    <w:p>
+      <w:pPr>
+        <w:numPr>
+          <w:ilvl w:val="0"/>
+          <w:numId w:val="1"/>
+        </w:numPr>
+        <w:spacing w:after="80"/>
+      </w:pPr>
+      <w:r>
+        <w:t>Modificacion simulada en /etc/ssh/sshd_config (PermitRootLogin yes). ✓</w:t>
+      </w:r>
+    </w:p>
+    <w:p>
+      <w:pPr>
+        <w:numPr>
+          <w:ilvl w:val="0"/>
+          <w:numId w:val="1"/>
+        </w:numPr>
+        <w:spacing w:after="80"/>
+      </w:pPr>
+      <w:r>
+        <w:t>Alerta FIM generada en tiempo real con hashes MD5/SHA1/SHA256 antes y despues. ✓</w:t>
+      </w:r>
+    </w:p>
+    <w:p>
+      <w:pPr>
+        <w:numPr>
+          <w:ilvl w:val="0"/>
+          <w:numId w:val="1"/>
+        </w:numPr>
+        <w:spacing w:after="80"/>
+      </w:pPr>
+      <w:r>
+        <w:t>Relevancia documentada: deteccion de persistencia de atacante via modificacion de sshd_config. ✓</w:t>
+      </w:r>
+    </w:p>
+    <w:p>
+      <w:pPr>
+        <w:numPr>
+          <w:ilvl w:val="0"/>
+          <w:numId w:val="1"/>
+        </w:numPr>
+        <w:spacing w:after="80"/>
+      </w:pPr>
+      <w:r>
+        <w:t>Cumplimiento demostrado: PCI-DSS (monitorizacion de integridad de archivos criticos), ISO 27001. ✓</w:t>
       </w:r>
     </w:p>
     <w:sectPr>

</xml_diff>